<commit_message>
automation testing with playwright code is added
</commit_message>
<xml_diff>
--- a/Manual_Testing/Bug reports/UserRegistration.docx
+++ b/Manual_Testing/Bug reports/UserRegistration.docx
@@ -228,92 +228,37 @@
           <w:b/>
           <w:bCs/>
         </w:rPr>
-        <w:t>Priority: High</w:t>
-      </w:r>
-    </w:p>
-    <w:p>
-      <w:pPr>
-        <w:rPr>
-          <w:b/>
-          <w:bCs/>
-        </w:rPr>
-      </w:pPr>
-    </w:p>
-    <w:p>
-      <w:pPr>
-        <w:rPr>
-          <w:b/>
-          <w:bCs/>
-        </w:rPr>
-      </w:pPr>
-      <w:r>
-        <w:rPr>
-          <w:b/>
-          <w:bCs/>
-        </w:rPr>
-        <w:tab/>
-      </w:r>
-    </w:p>
-    <w:p>
-      <w:pPr>
-        <w:rPr>
-          <w:b/>
-          <w:bCs/>
-        </w:rPr>
-      </w:pPr>
-    </w:p>
-    <w:p>
-      <w:pPr>
-        <w:rPr>
-          <w:b/>
-          <w:bCs/>
-        </w:rPr>
-      </w:pPr>
-    </w:p>
-    <w:p>
-      <w:pPr>
-        <w:rPr>
-          <w:b/>
-          <w:bCs/>
-        </w:rPr>
-      </w:pPr>
-    </w:p>
-    <w:p>
-      <w:pPr>
-        <w:rPr>
-          <w:b/>
-          <w:bCs/>
-        </w:rPr>
-      </w:pPr>
-    </w:p>
-    <w:p>
-      <w:pPr>
-        <w:rPr>
-          <w:b/>
-          <w:bCs/>
-        </w:rPr>
-      </w:pPr>
-    </w:p>
-    <w:p>
-      <w:pPr>
-        <w:rPr>
-          <w:b/>
-          <w:bCs/>
-        </w:rPr>
-      </w:pPr>
-    </w:p>
-    <w:p>
-      <w:pPr>
-        <w:rPr>
-          <w:b/>
-          <w:bCs/>
-        </w:rPr>
-      </w:pPr>
-      <w:r>
-        <w:rPr>
-          <w:b/>
-          <w:bCs/>
-        </w:rPr>
+        <w:t>Priority: Hig</w:t>
+      </w:r>
+      <w:r>
+        <w:rPr>
+          <w:b/>
+          <w:bCs/>
+        </w:rPr>
+        <w:t>h</w:t>
+      </w:r>
+    </w:p>
+    <w:p>
+      <w:pPr>
+        <w:rPr>
+          <w:b/>
+          <w:bCs/>
+        </w:rPr>
+      </w:pPr>
+    </w:p>
+    <w:p>
+      <w:pPr>
+        <w:rPr>
+          <w:b/>
+          <w:bCs/>
+        </w:rPr>
+      </w:pPr>
+      <w:r>
+        <w:rPr>
+          <w:b/>
+          <w:bCs/>
+        </w:rPr>
+        <w:lastRenderedPageBreak/>
         <w:t xml:space="preserve"> BUG 2</w:t>
       </w:r>
     </w:p>
@@ -376,7 +321,6 @@
     </w:p>
     <w:p>
       <w:r>
-        <w:lastRenderedPageBreak/>
         <w:t>System accepts last name containing numeric and special characters (e.g., Jindal!2).</w:t>
       </w:r>
     </w:p>
@@ -547,160 +491,102 @@
           <w:b/>
           <w:bCs/>
         </w:rPr>
-        <w:t>Priority: High</w:t>
-      </w:r>
-    </w:p>
-    <w:p>
-      <w:pPr>
+        <w:t>Priority: Hi</w:t>
+      </w:r>
+      <w:r>
+        <w:rPr>
+          <w:b/>
+          <w:bCs/>
+        </w:rPr>
+        <w:t>gh</w:t>
+      </w:r>
+    </w:p>
+    <w:p>
+      <w:pPr>
+        <w:rPr>
+          <w:b/>
+          <w:bCs/>
+        </w:rPr>
+      </w:pPr>
+    </w:p>
+    <w:p>
+      <w:pPr>
+        <w:rPr>
+          <w:b/>
+          <w:bCs/>
+        </w:rPr>
+      </w:pPr>
+    </w:p>
+    <w:p>
+      <w:pPr>
+        <w:rPr>
+          <w:b/>
+          <w:bCs/>
+        </w:rPr>
+      </w:pPr>
+      <w:r>
+        <w:rPr>
+          <w:b/>
+          <w:bCs/>
+        </w:rPr>
+        <w:t>BUG 3</w:t>
+      </w:r>
+    </w:p>
+    <w:p>
+      <w:pPr>
+        <w:rPr>
+          <w:b/>
+          <w:bCs/>
+        </w:rPr>
+      </w:pPr>
+      <w:r>
+        <w:rPr>
+          <w:b/>
+          <w:bCs/>
+        </w:rPr>
+        <w:t xml:space="preserve">Bug ID: </w:t>
+      </w:r>
+    </w:p>
+    <w:p>
+      <w:pPr>
+        <w:rPr>
+          <w:b/>
+          <w:bCs/>
+        </w:rPr>
+      </w:pPr>
+      <w:r>
+        <w:rPr>
+          <w:b/>
+          <w:bCs/>
+        </w:rPr>
+        <w:t xml:space="preserve">Bug </w:t>
+      </w:r>
+      <w:r>
+        <w:rPr>
+          <w:b/>
+          <w:bCs/>
+        </w:rPr>
+        <w:t>Summary:</w:t>
+      </w:r>
+    </w:p>
+    <w:p>
+      <w:r>
+        <w:t>Telephone field is missing on Registration page</w:t>
+      </w:r>
+    </w:p>
+    <w:p>
+      <w:pPr>
+        <w:rPr>
+          <w:b/>
+          <w:bCs/>
+        </w:rPr>
+      </w:pPr>
+      <w:r>
         <w:rPr>
           <w:rFonts w:ascii="Times New Roman" w:hAnsi="Times New Roman" w:cs="Times New Roman"/>
           <w:b/>
           <w:bCs/>
         </w:rPr>
-      </w:pPr>
-    </w:p>
-    <w:p>
-      <w:pPr>
-        <w:rPr>
-          <w:rFonts w:ascii="Times New Roman" w:hAnsi="Times New Roman" w:cs="Times New Roman"/>
-          <w:b/>
-          <w:bCs/>
-        </w:rPr>
-      </w:pPr>
-    </w:p>
-    <w:p>
-      <w:pPr>
-        <w:rPr>
-          <w:rFonts w:ascii="Times New Roman" w:hAnsi="Times New Roman" w:cs="Times New Roman"/>
-          <w:b/>
-          <w:bCs/>
-        </w:rPr>
-      </w:pPr>
-    </w:p>
-    <w:p>
-      <w:pPr>
-        <w:rPr>
-          <w:rFonts w:ascii="Times New Roman" w:hAnsi="Times New Roman" w:cs="Times New Roman"/>
-          <w:b/>
-          <w:bCs/>
-        </w:rPr>
-      </w:pPr>
-    </w:p>
-    <w:p>
-      <w:pPr>
-        <w:rPr>
-          <w:rFonts w:ascii="Times New Roman" w:hAnsi="Times New Roman" w:cs="Times New Roman"/>
-          <w:b/>
-          <w:bCs/>
-        </w:rPr>
-      </w:pPr>
-    </w:p>
-    <w:p>
-      <w:pPr>
-        <w:rPr>
-          <w:rFonts w:ascii="Times New Roman" w:hAnsi="Times New Roman" w:cs="Times New Roman"/>
-          <w:b/>
-          <w:bCs/>
-        </w:rPr>
-      </w:pPr>
-    </w:p>
-    <w:p>
-      <w:pPr>
-        <w:rPr>
-          <w:rFonts w:ascii="Times New Roman" w:hAnsi="Times New Roman" w:cs="Times New Roman"/>
-          <w:b/>
-          <w:bCs/>
-        </w:rPr>
-      </w:pPr>
-    </w:p>
-    <w:p>
-      <w:pPr>
-        <w:rPr>
-          <w:rFonts w:ascii="Times New Roman" w:hAnsi="Times New Roman" w:cs="Times New Roman"/>
-          <w:b/>
-          <w:bCs/>
-        </w:rPr>
-      </w:pPr>
-    </w:p>
-    <w:p>
-      <w:pPr>
-        <w:rPr>
-          <w:rFonts w:ascii="Times New Roman" w:hAnsi="Times New Roman" w:cs="Times New Roman"/>
-          <w:b/>
-          <w:bCs/>
-        </w:rPr>
-      </w:pPr>
-    </w:p>
-    <w:p>
-      <w:pPr>
-        <w:rPr>
-          <w:rFonts w:ascii="Times New Roman" w:hAnsi="Times New Roman" w:cs="Times New Roman"/>
-          <w:b/>
-          <w:bCs/>
-        </w:rPr>
-      </w:pPr>
-    </w:p>
-    <w:p>
-      <w:pPr>
-        <w:rPr>
-          <w:rFonts w:ascii="Times New Roman" w:hAnsi="Times New Roman" w:cs="Times New Roman"/>
-          <w:b/>
-          <w:bCs/>
-        </w:rPr>
-      </w:pPr>
-    </w:p>
-    <w:p>
-      <w:pPr>
-        <w:rPr>
-          <w:rFonts w:ascii="Times New Roman" w:hAnsi="Times New Roman" w:cs="Times New Roman"/>
-          <w:b/>
-          <w:bCs/>
-        </w:rPr>
-      </w:pPr>
-    </w:p>
-    <w:p/>
-    <w:p>
-      <w:pPr>
-        <w:rPr>
-          <w:b/>
-          <w:bCs/>
-        </w:rPr>
-      </w:pPr>
-      <w:r>
-        <w:rPr>
-          <w:b/>
-          <w:bCs/>
-        </w:rPr>
-        <w:t>BUG 3</w:t>
-      </w:r>
-    </w:p>
-    <w:p>
-      <w:pPr>
-        <w:rPr>
-          <w:b/>
-          <w:bCs/>
-        </w:rPr>
-      </w:pPr>
-      <w:r>
-        <w:rPr>
-          <w:b/>
-          <w:bCs/>
-        </w:rPr>
-        <w:t xml:space="preserve">Bug ID: </w:t>
-      </w:r>
-    </w:p>
-    <w:p>
-      <w:pPr>
-        <w:rPr>
-          <w:b/>
-          <w:bCs/>
-        </w:rPr>
-      </w:pPr>
-      <w:r>
-        <w:rPr>
-          <w:b/>
-          <w:bCs/>
-        </w:rPr>
         <w:t xml:space="preserve">Bug </w:t>
       </w:r>
       <w:r>
@@ -708,34 +594,6 @@
           <w:b/>
           <w:bCs/>
         </w:rPr>
-        <w:t>Summary:</w:t>
-      </w:r>
-    </w:p>
-    <w:p>
-      <w:r>
-        <w:t>Telephone field is missing on Registration page</w:t>
-      </w:r>
-    </w:p>
-    <w:p>
-      <w:pPr>
-        <w:rPr>
-          <w:b/>
-          <w:bCs/>
-        </w:rPr>
-      </w:pPr>
-      <w:r>
-        <w:rPr>
-          <w:rFonts w:ascii="Times New Roman" w:hAnsi="Times New Roman" w:cs="Times New Roman"/>
-          <w:b/>
-          <w:bCs/>
-        </w:rPr>
-        <w:t xml:space="preserve">Bug </w:t>
-      </w:r>
-      <w:r>
-        <w:rPr>
-          <w:b/>
-          <w:bCs/>
-        </w:rPr>
         <w:t>Description:</w:t>
       </w:r>
     </w:p>
@@ -756,7 +614,6 @@
           <w:b/>
           <w:bCs/>
         </w:rPr>
-        <w:lastRenderedPageBreak/>
         <w:t>Steps to Reproduce:</w:t>
       </w:r>
     </w:p>
@@ -929,62 +786,6 @@
           <w:bCs/>
         </w:rPr>
       </w:pPr>
-    </w:p>
-    <w:p>
-      <w:pPr>
-        <w:rPr>
-          <w:b/>
-          <w:bCs/>
-        </w:rPr>
-      </w:pPr>
-    </w:p>
-    <w:p>
-      <w:pPr>
-        <w:rPr>
-          <w:b/>
-          <w:bCs/>
-        </w:rPr>
-      </w:pPr>
-    </w:p>
-    <w:p>
-      <w:pPr>
-        <w:rPr>
-          <w:b/>
-          <w:bCs/>
-        </w:rPr>
-      </w:pPr>
-    </w:p>
-    <w:p>
-      <w:pPr>
-        <w:rPr>
-          <w:b/>
-          <w:bCs/>
-        </w:rPr>
-      </w:pPr>
-    </w:p>
-    <w:p>
-      <w:pPr>
-        <w:rPr>
-          <w:b/>
-          <w:bCs/>
-        </w:rPr>
-      </w:pPr>
-    </w:p>
-    <w:p>
-      <w:pPr>
-        <w:rPr>
-          <w:b/>
-          <w:bCs/>
-        </w:rPr>
-      </w:pPr>
-    </w:p>
-    <w:p>
-      <w:pPr>
-        <w:rPr>
-          <w:b/>
-          <w:bCs/>
-        </w:rPr>
-      </w:pPr>
       <w:r>
         <w:rPr>
           <w:b/>
@@ -1085,7 +886,6 @@
         </w:numPr>
       </w:pPr>
       <w:r>
-        <w:lastRenderedPageBreak/>
         <w:t>Navigate to Registration page</w:t>
       </w:r>
     </w:p>
@@ -1139,6 +939,7 @@
     </w:p>
     <w:p>
       <w:r>
+        <w:lastRenderedPageBreak/>
         <w:t>Telephone field not present in UI.</w:t>
       </w:r>
     </w:p>
@@ -1429,7 +1230,6 @@
         </w:numPr>
       </w:pPr>
       <w:r>
-        <w:lastRenderedPageBreak/>
         <w:t>Navigate to Registration page</w:t>
       </w:r>
     </w:p>
@@ -1772,7 +1572,6 @@
         </w:numPr>
       </w:pPr>
       <w:r>
-        <w:lastRenderedPageBreak/>
         <w:t>Fill all other fields with valid data</w:t>
       </w:r>
     </w:p>
@@ -2009,7 +1808,6 @@
         </w:numPr>
       </w:pPr>
       <w:r>
-        <w:lastRenderedPageBreak/>
         <w:t>Fill all other fields with valid data</w:t>
       </w:r>
     </w:p>
@@ -2238,7 +2036,6 @@
         </w:numPr>
       </w:pPr>
       <w:r>
-        <w:lastRenderedPageBreak/>
         <w:t>Fill all other fields with valid data</w:t>
       </w:r>
     </w:p>
@@ -2453,7 +2250,6 @@
         </w:numPr>
       </w:pPr>
       <w:r>
-        <w:lastRenderedPageBreak/>
         <w:t>Navigate to Registration page</w:t>
       </w:r>
     </w:p>

</xml_diff>